<commit_message>
Level One 2.2: technical words explained, themed glossary, plan note
</commit_message>
<xml_diff>
--- a/source/en/2-level-one.docx
+++ b/source/en/2-level-one.docx
@@ -135,7 +135,7 @@
           <w:sz w:val="20"/>
           <w:szCs w:val="20"/>
         </w:rPr>
-        <w:t xml:space="preserve">Version 2.1 — August 2026</w:t>
+        <w:t xml:space="preserve">Version 2.2 — September 2026</w:t>
       </w:r>
     </w:p>
     <w:p>
@@ -163,6 +163,105 @@
       <w:r>
         <w:t xml:space="preserve">This is Level One. It assumes you have done the things in Level Zero: you can set up Claude, run a task in Cowork, find your files, and manage a session. If those are not yet comfortable, read Level Zero first — this book builds straight on it.</w:t>
       </w:r>
+    </w:p>
+    <w:p>
+      <w:pPr>
+        <w:keepLines/>
+        <w:widowControl/>
+        <w:spacing w:after="100" w:line="262"/>
+      </w:pPr>
+      <w:r>
+        <w:rPr>
+          <w:b/>
+          <w:bCs/>
+        </w:rPr>
+        <w:t xml:space="preserve">Never used an AI?</w:t>
+      </w:r>
+      <w:r>
+        <w:t xml:space="preserve"> Start with the two-page </w:t>
+      </w:r>
+      <w:r>
+        <w:rPr>
+          <w:b/>
+          <w:bCs/>
+        </w:rPr>
+        <w:t xml:space="preserve">Start here</w:t>
+      </w:r>
+      <w:r>
+        <w:t xml:space="preserve"> guide, then Level Zero.</w:t>
+      </w:r>
+    </w:p>
+    <w:tbl>
+      <w:tblPr>
+        <w:tblW w:type="dxa" w:w="9026"/>
+      </w:tblPr>
+      <w:tblGrid>
+        <w:gridCol w:w="9026"/>
+      </w:tblGrid>
+      <w:tr>
+        <w:trPr>
+          <w:cantSplit/>
+        </w:trPr>
+        <w:tc>
+          <w:tcPr>
+            <w:tcW w:type="dxa" w:w="9026"/>
+            <w:tcBorders>
+              <w:top w:val="single" w:color="B7892B" w:sz="2"/>
+              <w:left w:val="single" w:color="B7892B" w:sz="18"/>
+              <w:bottom w:val="single" w:color="B7892B" w:sz="2"/>
+              <w:right w:val="single" w:color="B7892B" w:sz="2"/>
+            </w:tcBorders>
+            <w:shd w:fill="FFF6E0" w:val="clear"/>
+            <w:tcMar>
+              <w:top w:type="dxa" w:w="120"/>
+              <w:left w:type="dxa" w:w="200"/>
+              <w:bottom w:type="dxa" w:w="120"/>
+              <w:right w:type="dxa" w:w="160"/>
+            </w:tcMar>
+          </w:tcPr>
+          <w:p>
+            <w:pPr>
+              <w:keepNext/>
+              <w:spacing w:after="60"/>
+            </w:pPr>
+            <w:r>
+              <w:rPr>
+                <w:b/>
+                <w:bCs/>
+                <w:color w:val="B7892B"/>
+                <w:sz w:val="22"/>
+                <w:szCs w:val="22"/>
+              </w:rPr>
+              <w:t xml:space="preserve">Which plan do you need?</w:t>
+            </w:r>
+          </w:p>
+          <w:p>
+            <w:pPr>
+              <w:keepLines/>
+              <w:widowControl/>
+              <w:spacing w:after="60" w:line="262"/>
+            </w:pPr>
+            <w:r>
+              <w:t xml:space="preserve">Most of Level One uses Cowork, Code, connectors and scheduled tasks. They need a paid plan (see Level Zero, Chapter 3).</w:t>
+            </w:r>
+          </w:p>
+          <w:p>
+            <w:pPr>
+              <w:keepLines/>
+              <w:widowControl/>
+              <w:spacing w:after="60" w:line="262"/>
+            </w:pPr>
+            <w:r>
+              <w:t xml:space="preserve">Chapter 1 (prompting) and Chapter 5 (data and GDPR) are useful on any plan.</w:t>
+            </w:r>
+          </w:p>
+        </w:tc>
+      </w:tr>
+    </w:tbl>
+    <w:p>
+      <w:pPr>
+        <w:spacing w:after="80" w:line="120" w:lineRule="exact"/>
+      </w:pPr>
     </w:p>
     <w:p>
       <w:pPr>
@@ -375,7 +474,7 @@
                 <w:sz w:val="22"/>
                 <w:szCs w:val="22"/>
               </w:rPr>
-              <w:t xml:space="preserve">What is new in version 2.1</w:t>
+              <w:t xml:space="preserve">What is new in version 2.2</w:t>
             </w:r>
           </w:p>
           <w:p>
@@ -386,7 +485,7 @@
               <w:spacing w:after="100" w:line="262"/>
             </w:pPr>
             <w:r>
-              <w:t xml:space="preserve">Added: "Record a skill" in Cowork (Chapter 3) and Claude Design (Chapter 10). Updated: where Projects now live in the new single app home, and a reminder that models and screens change quickly.</w:t>
+              <w:t xml:space="preserve">Added: a short explanation of each technical word where it first appears; a glossary grouped by theme; a note on which plan you need. Updated: personal rules of thumb are now marked as experience, not fact.</w:t>
             </w:r>
           </w:p>
         </w:tc>
@@ -402,6 +501,7 @@
         <w:pStyle w:val="Heading1"/>
         <w:keepNext/>
         <w:keepLines/>
+        <w:outlineLvl w:val="9"/>
       </w:pPr>
       <w:r>
         <w:t xml:space="preserve">Table of Contents</w:t>
@@ -420,7 +520,13 @@
           </w:r>
         </w:p>
         <w:p>
+          <w:pPr>
+            <w:spacing w:before="0" w:after="0" w:line="20" w:lineRule="exact"/>
+          </w:pPr>
           <w:r>
+            <w:rPr>
+              <w:sz w:val="2"/>
+            </w:rPr>
             <w:fldChar w:fldCharType="end"/>
           </w:r>
         </w:p>
@@ -1089,7 +1195,7 @@
         <w:spacing w:after="100" w:line="262"/>
       </w:pPr>
       <w:r>
-        <w:t xml:space="preserve">Don't aim to one-shot important work. Ask for a draft, react to it, and let Claude adjust. Three quick rounds of "good, but shorter and less formal" beat thirty minutes crafting the perfect first prompt.</w:t>
+        <w:t xml:space="preserve">Don't aim to one-shot important work. Ask for a draft, react to it, and let Claude adjust. In my experience, three quick rounds of "good, but shorter and less formal" beat thirty minutes crafting the perfect first prompt.</w:t>
       </w:r>
     </w:p>
     <w:p>
@@ -1183,7 +1289,7 @@
         <w:spacing w:after="100" w:line="262"/>
       </w:pPr>
       <w:r>
-        <w:t xml:space="preserve">Project instructions are not documentation — they are the minimum that stops Claude drifting. Five to eight lines:</w:t>
+        <w:t xml:space="preserve">Project instructions are not documentation — they are the minimum that stops Claude drifting. In my experience, five to eight lines is enough:</w:t>
       </w:r>
     </w:p>
     <w:p>
@@ -1309,7 +1415,7 @@
               <w:spacing w:after="100" w:line="262"/>
             </w:pPr>
             <w:r>
-              <w:t xml:space="preserve">More files do not mean better answers — they mean more noise to filter. Upload examples of good work and the templates you reuse, not your whole archive. If an answer drifts, the cause is often too many files, not too few.</w:t>
+              <w:t xml:space="preserve">More files do not mean better answers — they mean more noise to filter. Upload examples of good work and the templates you reuse, not your whole archive. In my experience, when an answer drifts, the cause is often too many files, not too few.</w:t>
             </w:r>
           </w:p>
         </w:tc>
@@ -1700,7 +1806,7 @@
         <w:t xml:space="preserve">Anthropic's built-in integrations </w:t>
       </w:r>
       <w:r>
-        <w:t xml:space="preserve">— first-party (Gmail, Drive, GitHub, Slack…).</w:t>
+        <w:t xml:space="preserve">— first-party, made by Anthropic itself (Gmail, Drive, GitHub, Slack…).</w:t>
       </w:r>
     </w:p>
     <w:p>
@@ -1723,7 +1829,7 @@
         <w:t xml:space="preserve">Directory connectors </w:t>
       </w:r>
       <w:r>
-        <w:t xml:space="preserve">— third-party, but reviewed and vetted by Anthropic before listing.</w:t>
+        <w:t xml:space="preserve">— third-party (made by other companies), but reviewed and vetted by Anthropic before listing.</w:t>
       </w:r>
     </w:p>
     <w:p>
@@ -1767,7 +1873,7 @@
         <w:spacing w:after="100" w:line="262"/>
       </w:pPr>
       <w:r>
-        <w:t xml:space="preserve">Start read-only. Ask Claude to summarize today's unread mail, or list this week's meetings, before you let it send or change anything. Build trust on tasks where a mistake is harmless, then widen from there.</w:t>
+        <w:t xml:space="preserve">Start read-only (Claude can look, but not send or change anything). Ask Claude to summarize today's unread mail, or list this week's meetings, before you let it send or change anything. Build trust on tasks where a mistake is harmless, then widen from there.</w:t>
       </w:r>
     </w:p>
     <w:p>
@@ -1788,7 +1894,7 @@
         <w:spacing w:after="100" w:line="262"/>
       </w:pPr>
       <w:r>
-        <w:t xml:space="preserve">The moment Claude touches real business data — through a connector, a pasted document, or a folder — data protection becomes your responsibility. This chapter is practical awareness, not legal advice; when in doubt, ask your data-protection officer.</w:t>
+        <w:t xml:space="preserve">The moment Claude touches real business data — through a connector, a pasted document, or a folder — data protection becomes your responsibility. This chapter is practical awareness, not legal advice; when in doubt, ask your data-protection officer (the person in your organisation responsible for personal data).</w:t>
       </w:r>
     </w:p>
     <w:p>
@@ -1862,7 +1968,7 @@
         <w:spacing w:after="46" w:line="258"/>
       </w:pPr>
       <w:r>
-        <w:t xml:space="preserve">Could I anonymise or redact it and still get the result?</w:t>
+        <w:t xml:space="preserve">Could I anonymise or redact it (remove names and details that identify people) and still get the result?</w:t>
       </w:r>
     </w:p>
     <w:p>
@@ -2037,7 +2143,7 @@
               <w:spacing w:after="100" w:line="262"/>
             </w:pPr>
             <w:r>
-              <w:t xml:space="preserve">Chat, Cowork and Code all send your content to Anthropic's servers to be processed — Claude does not run on your computer, and no setting makes your data stay local. You CAN turn off using your conversations to train the models (Settings, Privacy), which also shortens retention. Team, Enterprise and API accounts do not train on your data by default and offer stronger retention controls. For truly local, offline AI you would need a different, self-hosted model — which is not Claude.</w:t>
+              <w:t xml:space="preserve">Chat, Cowork and Code all send your content to Anthropic's servers to be processed — Claude does not run on your computer, and no setting makes your data stay local. You CAN turn off using your conversations to train the models (Settings, Privacy), which also shortens retention (how long your data is kept). Team, Enterprise and API accounts do not train on your data by default and offer stronger retention controls. For truly local, offline AI you would need a different, self-hosted model — which is not Claude.</w:t>
             </w:r>
           </w:p>
         </w:tc>
@@ -2430,7 +2536,7 @@
         <w:t xml:space="preserve">With others on the same files? </w:t>
       </w:r>
       <w:r>
-        <w:t xml:space="preserve">Git for code; a shared SharePoint or Drive library for documents.</w:t>
+        <w:t xml:space="preserve">Git for code; a shared SharePoint (Microsoft's shared document library) or Drive library for documents.</w:t>
       </w:r>
     </w:p>
     <w:p>
@@ -2451,7 +2557,7 @@
         <w:spacing w:after="100" w:line="262"/>
       </w:pPr>
       <w:r>
-        <w:t xml:space="preserve">Whatever you choose, point Cowork or Code at a clean project folder with an obvious shape: source files, a place for outputs, a notes or README file, and nothing unrelated. A tidy folder makes Claude faster and your teammates calmer.</w:t>
+        <w:t xml:space="preserve">Whatever you choose, point Cowork or Code at a clean project folder with an obvious shape: source files, a place for outputs, a notes or README file (a short text that explains the project), and nothing unrelated. A tidy folder makes Claude faster and your teammates calmer.</w:t>
       </w:r>
     </w:p>
     <w:p>
@@ -3341,7 +3447,7 @@
         <w:t xml:space="preserve">Bypass all permissions </w:t>
       </w:r>
       <w:r>
-        <w:t xml:space="preserve">(fast "vibe" mode): only in a dedicated, Git-backed folder whose files you could replace — never on your home directory.</w:t>
+        <w:t xml:space="preserve">(fast "vibe" mode): only in a dedicated, Git-backed folder whose files you could replace — never on your home directory (your whole personal user folder).</w:t>
       </w:r>
     </w:p>
     <w:p>
@@ -3404,7 +3510,7 @@
         <w:spacing w:after="100" w:line="262"/>
       </w:pPr>
       <w:r>
-        <w:t xml:space="preserve">A cousin of Code, launched in 2026 as a research preview at </w:t>
+        <w:t xml:space="preserve">A cousin of Code, launched in 2026 as a research preview (an early test version) at </w:t>
       </w:r>
       <w:r>
         <w:rPr>
@@ -3413,7 +3519,7 @@
         <w:t xml:space="preserve">claude.ai/design</w:t>
       </w:r>
       <w:r>
-        <w:t xml:space="preserve">, Claude Design builds the look of things — mockups, landing pages, simple websites and slide decks — from a plain description. Unlike an image generator it produces the real thing: a working layout with buttons you can actually click, not a picture of one. Reach for it when what you want is a page or a design rather than software. It is on Pro, Max, Team and Enterprise; being a research preview, expect it to keep changing.</w:t>
+        <w:t xml:space="preserve">, Claude Design builds the look of things — mockups (first sketches of a screen), landing pages, simple websites and slide decks — from a plain description. Unlike an image generator it produces the real thing: a working layout with buttons you can actually click, not a picture of one. Reach for it when what you want is a page or a design rather than software. It is on Pro, Max, Team and Enterprise; being a research preview, expect it to keep changing.</w:t>
       </w:r>
     </w:p>
     <w:p>
@@ -4008,7 +4114,7 @@
                 <w:sz w:val="21"/>
                 <w:szCs w:val="21"/>
               </w:rPr>
-              <w:t xml:space="preserve">Connecting to and copying files to a server or Pi.</w:t>
+              <w:t xml:space="preserve">Connecting to and copying files to a server or a Raspberry Pi (a small, low-cost computer).</w:t>
             </w:r>
           </w:p>
         </w:tc>
@@ -4384,6 +4490,23 @@
         <w:t xml:space="preserve">Glossary of new terms</w:t>
       </w:r>
     </w:p>
+    <w:p>
+      <w:pPr>
+        <w:keepNext/>
+        <w:keepLines/>
+        <w:spacing w:before="160" w:after="60"/>
+      </w:pPr>
+      <w:r>
+        <w:rPr>
+          <w:b/>
+          <w:bCs/>
+          <w:color w:val="1F3A5F"/>
+          <w:sz w:val="24"/>
+          <w:szCs w:val="24"/>
+        </w:rPr>
+        <w:t xml:space="preserve">Prompting and projects</w:t>
+      </w:r>
+    </w:p>
     <w:tbl>
       <w:tblPr>
         <w:tblW w:type="dxa" w:w="9026"/>
@@ -4397,8 +4520,8 @@
         </w:tblBorders>
       </w:tblPr>
       <w:tblGrid>
-        <w:gridCol w:w="2600"/>
-        <w:gridCol w:w="6426"/>
+        <w:gridCol w:w="2300"/>
+        <w:gridCol w:w="6726"/>
       </w:tblGrid>
       <w:tr>
         <w:trPr>
@@ -4407,16 +4530,20 @@
         </w:trPr>
         <w:tc>
           <w:tcPr>
-            <w:tcW w:type="dxa" w:w="2600"/>
+            <w:tcW w:type="dxa" w:w="2300"/>
             <w:shd w:fill="1F3A5F" w:val="clear"/>
             <w:tcMar>
-              <w:top w:type="dxa" w:w="80"/>
-              <w:left w:type="dxa" w:w="120"/>
-              <w:bottom w:type="dxa" w:w="80"/>
-              <w:right w:type="dxa" w:w="120"/>
-            </w:tcMar>
-          </w:tcPr>
-          <w:p>
+              <w:top w:type="dxa" w:w="70"/>
+              <w:left w:type="dxa" w:w="120"/>
+              <w:bottom w:type="dxa" w:w="70"/>
+              <w:right w:type="dxa" w:w="120"/>
+            </w:tcMar>
+          </w:tcPr>
+          <w:p>
+            <w:pPr>
+              <w:keepNext/>
+              <w:spacing w:after="0"/>
+            </w:pPr>
             <w:r>
               <w:rPr>
                 <w:b/>
@@ -4431,16 +4558,20 @@
         </w:tc>
         <w:tc>
           <w:tcPr>
-            <w:tcW w:type="dxa" w:w="6426"/>
+            <w:tcW w:type="dxa" w:w="6726"/>
             <w:shd w:fill="1F3A5F" w:val="clear"/>
             <w:tcMar>
-              <w:top w:type="dxa" w:w="80"/>
-              <w:left w:type="dxa" w:w="120"/>
-              <w:bottom w:type="dxa" w:w="80"/>
-              <w:right w:type="dxa" w:w="120"/>
-            </w:tcMar>
-          </w:tcPr>
-          <w:p>
+              <w:top w:type="dxa" w:w="70"/>
+              <w:left w:type="dxa" w:w="120"/>
+              <w:bottom w:type="dxa" w:w="70"/>
+              <w:right w:type="dxa" w:w="120"/>
+            </w:tcMar>
+          </w:tcPr>
+          <w:p>
+            <w:pPr>
+              <w:keepNext/>
+              <w:spacing w:after="0"/>
+            </w:pPr>
             <w:r>
               <w:rPr>
                 <w:b/>
@@ -4460,7 +4591,7 @@
         </w:trPr>
         <w:tc>
           <w:tcPr>
-            <w:tcW w:type="dxa" w:w="2600"/>
+            <w:tcW w:type="dxa" w:w="2300"/>
             <w:shd w:fill="EDF2F7" w:val="clear"/>
             <w:tcMar>
               <w:top w:type="dxa" w:w="70"/>
@@ -4470,18 +4601,21 @@
             </w:tcMar>
           </w:tcPr>
           <w:p>
-            <w:r>
-              <w:rPr>
-                <w:sz w:val="21"/>
-                <w:szCs w:val="21"/>
-              </w:rPr>
-              <w:t xml:space="preserve">Repository (repo)</w:t>
-            </w:r>
-          </w:p>
-        </w:tc>
-        <w:tc>
-          <w:tcPr>
-            <w:tcW w:type="dxa" w:w="6426"/>
+            <w:pPr>
+              <w:spacing w:after="0"/>
+            </w:pPr>
+            <w:r>
+              <w:rPr>
+                <w:sz w:val="21"/>
+                <w:szCs w:val="21"/>
+              </w:rPr>
+              <w:t xml:space="preserve">Anti-style file</w:t>
+            </w:r>
+          </w:p>
+        </w:tc>
+        <w:tc>
+          <w:tcPr>
+            <w:tcW w:type="dxa" w:w="6726"/>
             <w:shd w:fill="EDF2F7" w:val="clear"/>
             <w:tcMar>
               <w:top w:type="dxa" w:w="70"/>
@@ -4491,12 +4625,15 @@
             </w:tcMar>
           </w:tcPr>
           <w:p>
-            <w:r>
-              <w:rPr>
-                <w:sz w:val="21"/>
-                <w:szCs w:val="21"/>
-              </w:rPr>
-              <w:t xml:space="preserve">A project folder plus its full history of saved snapshots, managed by Git.</w:t>
+            <w:pPr>
+              <w:spacing w:after="0"/>
+            </w:pPr>
+            <w:r>
+              <w:rPr>
+                <w:sz w:val="21"/>
+                <w:szCs w:val="21"/>
+              </w:rPr>
+              <w:t xml:space="preserve">A short list of words and patterns you never want Claude to use.</w:t>
             </w:r>
           </w:p>
         </w:tc>
@@ -4507,7 +4644,7 @@
         </w:trPr>
         <w:tc>
           <w:tcPr>
-            <w:tcW w:type="dxa" w:w="2600"/>
+            <w:tcW w:type="dxa" w:w="2300"/>
             <w:shd w:fill="FFFFFF" w:val="clear"/>
             <w:tcMar>
               <w:top w:type="dxa" w:w="70"/>
@@ -4517,18 +4654,21 @@
             </w:tcMar>
           </w:tcPr>
           <w:p>
-            <w:r>
-              <w:rPr>
-                <w:sz w:val="21"/>
-                <w:szCs w:val="21"/>
-              </w:rPr>
-              <w:t xml:space="preserve">Commit</w:t>
-            </w:r>
-          </w:p>
-        </w:tc>
-        <w:tc>
-          <w:tcPr>
-            <w:tcW w:type="dxa" w:w="6426"/>
+            <w:pPr>
+              <w:spacing w:after="0"/>
+            </w:pPr>
+            <w:r>
+              <w:rPr>
+                <w:sz w:val="21"/>
+                <w:szCs w:val="21"/>
+              </w:rPr>
+              <w:t xml:space="preserve">Project instructions</w:t>
+            </w:r>
+          </w:p>
+        </w:tc>
+        <w:tc>
+          <w:tcPr>
+            <w:tcW w:type="dxa" w:w="6726"/>
             <w:shd w:fill="FFFFFF" w:val="clear"/>
             <w:tcMar>
               <w:top w:type="dxa" w:w="70"/>
@@ -4538,12 +4678,15 @@
             </w:tcMar>
           </w:tcPr>
           <w:p>
-            <w:r>
-              <w:rPr>
-                <w:sz w:val="21"/>
-                <w:szCs w:val="21"/>
-              </w:rPr>
-              <w:t xml:space="preserve">One saved snapshot, with a short message describing the change.</w:t>
+            <w:pPr>
+              <w:spacing w:after="0"/>
+            </w:pPr>
+            <w:r>
+              <w:rPr>
+                <w:sz w:val="21"/>
+                <w:szCs w:val="21"/>
+              </w:rPr>
+              <w:t xml:space="preserve">Five to eight lines telling Claude what a project is for and how to work.</w:t>
             </w:r>
           </w:p>
         </w:tc>
@@ -4554,7 +4697,7 @@
         </w:trPr>
         <w:tc>
           <w:tcPr>
-            <w:tcW w:type="dxa" w:w="2600"/>
+            <w:tcW w:type="dxa" w:w="2300"/>
             <w:shd w:fill="EDF2F7" w:val="clear"/>
             <w:tcMar>
               <w:top w:type="dxa" w:w="70"/>
@@ -4564,18 +4707,21 @@
             </w:tcMar>
           </w:tcPr>
           <w:p>
-            <w:r>
-              <w:rPr>
-                <w:sz w:val="21"/>
-                <w:szCs w:val="21"/>
-              </w:rPr>
-              <w:t xml:space="preserve">Push / Pull</w:t>
-            </w:r>
-          </w:p>
-        </w:tc>
-        <w:tc>
-          <w:tcPr>
-            <w:tcW w:type="dxa" w:w="6426"/>
+            <w:pPr>
+              <w:spacing w:after="0"/>
+            </w:pPr>
+            <w:r>
+              <w:rPr>
+                <w:sz w:val="21"/>
+                <w:szCs w:val="21"/>
+              </w:rPr>
+              <w:t xml:space="preserve">Skill</w:t>
+            </w:r>
+          </w:p>
+        </w:tc>
+        <w:tc>
+          <w:tcPr>
+            <w:tcW w:type="dxa" w:w="6726"/>
             <w:shd w:fill="EDF2F7" w:val="clear"/>
             <w:tcMar>
               <w:top w:type="dxa" w:w="70"/>
@@ -4585,12 +4731,15 @@
             </w:tcMar>
           </w:tcPr>
           <w:p>
-            <w:r>
-              <w:rPr>
-                <w:sz w:val="21"/>
-                <w:szCs w:val="21"/>
-              </w:rPr>
-              <w:t xml:space="preserve">Send your commits to the shared online copy / bring others' down to yours.</w:t>
+            <w:pPr>
+              <w:spacing w:after="0"/>
+            </w:pPr>
+            <w:r>
+              <w:rPr>
+                <w:sz w:val="21"/>
+                <w:szCs w:val="21"/>
+              </w:rPr>
+              <w:t xml:space="preserve">A reusable instruction file (SKILL.md) that teaches Claude one job.</w:t>
             </w:r>
           </w:p>
         </w:tc>
@@ -4601,7 +4750,7 @@
         </w:trPr>
         <w:tc>
           <w:tcPr>
-            <w:tcW w:type="dxa" w:w="2600"/>
+            <w:tcW w:type="dxa" w:w="2300"/>
             <w:shd w:fill="FFFFFF" w:val="clear"/>
             <w:tcMar>
               <w:top w:type="dxa" w:w="70"/>
@@ -4611,18 +4760,21 @@
             </w:tcMar>
           </w:tcPr>
           <w:p>
-            <w:r>
-              <w:rPr>
-                <w:sz w:val="21"/>
-                <w:szCs w:val="21"/>
-              </w:rPr>
-              <w:t xml:space="preserve">Branch</w:t>
-            </w:r>
-          </w:p>
-        </w:tc>
-        <w:tc>
-          <w:tcPr>
-            <w:tcW w:type="dxa" w:w="6426"/>
+            <w:pPr>
+              <w:spacing w:after="0"/>
+            </w:pPr>
+            <w:r>
+              <w:rPr>
+                <w:sz w:val="21"/>
+                <w:szCs w:val="21"/>
+              </w:rPr>
+              <w:t xml:space="preserve">Record a skill</w:t>
+            </w:r>
+          </w:p>
+        </w:tc>
+        <w:tc>
+          <w:tcPr>
+            <w:tcW w:type="dxa" w:w="6726"/>
             <w:shd w:fill="FFFFFF" w:val="clear"/>
             <w:tcMar>
               <w:top w:type="dxa" w:w="70"/>
@@ -4632,12 +4784,116 @@
             </w:tcMar>
           </w:tcPr>
           <w:p>
-            <w:r>
-              <w:rPr>
-                <w:sz w:val="21"/>
-                <w:szCs w:val="21"/>
-              </w:rPr>
-              <w:t xml:space="preserve">A safe side-track to try changes without touching the main version.</w:t>
+            <w:pPr>
+              <w:spacing w:after="0"/>
+            </w:pPr>
+            <w:r>
+              <w:rPr>
+                <w:sz w:val="21"/>
+                <w:szCs w:val="21"/>
+              </w:rPr>
+              <w:t xml:space="preserve">Show Claude a task once on screen; it turns the demonstration into a skill.</w:t>
+            </w:r>
+          </w:p>
+        </w:tc>
+      </w:tr>
+    </w:tbl>
+    <w:p>
+      <w:pPr>
+        <w:spacing w:after="80" w:line="120" w:lineRule="exact"/>
+      </w:pPr>
+    </w:p>
+    <w:p>
+      <w:pPr>
+        <w:keepNext/>
+        <w:keepLines/>
+        <w:spacing w:before="160" w:after="60"/>
+      </w:pPr>
+      <w:r>
+        <w:rPr>
+          <w:b/>
+          <w:bCs/>
+          <w:color w:val="1F3A5F"/>
+          <w:sz w:val="24"/>
+          <w:szCs w:val="24"/>
+        </w:rPr>
+        <w:t xml:space="preserve">Connecting and data</w:t>
+      </w:r>
+    </w:p>
+    <w:tbl>
+      <w:tblPr>
+        <w:tblW w:type="dxa" w:w="9026"/>
+        <w:tblBorders>
+          <w:top w:val="single" w:color="CCCCCC" w:sz="1"/>
+          <w:left w:val="single" w:color="CCCCCC" w:sz="1"/>
+          <w:bottom w:val="single" w:color="CCCCCC" w:sz="1"/>
+          <w:right w:val="single" w:color="CCCCCC" w:sz="1"/>
+          <w:insideH w:val="single" w:color="CCCCCC" w:sz="1"/>
+          <w:insideV w:val="single" w:color="CCCCCC" w:sz="1"/>
+        </w:tblBorders>
+      </w:tblPr>
+      <w:tblGrid>
+        <w:gridCol w:w="2300"/>
+        <w:gridCol w:w="6726"/>
+      </w:tblGrid>
+      <w:tr>
+        <w:trPr>
+          <w:cantSplit/>
+          <w:tblHeader/>
+        </w:trPr>
+        <w:tc>
+          <w:tcPr>
+            <w:tcW w:type="dxa" w:w="2300"/>
+            <w:shd w:fill="1F3A5F" w:val="clear"/>
+            <w:tcMar>
+              <w:top w:type="dxa" w:w="70"/>
+              <w:left w:type="dxa" w:w="120"/>
+              <w:bottom w:type="dxa" w:w="70"/>
+              <w:right w:type="dxa" w:w="120"/>
+            </w:tcMar>
+          </w:tcPr>
+          <w:p>
+            <w:pPr>
+              <w:keepNext/>
+              <w:spacing w:after="0"/>
+            </w:pPr>
+            <w:r>
+              <w:rPr>
+                <w:b/>
+                <w:bCs/>
+                <w:color w:val="FFFFFF"/>
+                <w:sz w:val="21"/>
+                <w:szCs w:val="21"/>
+              </w:rPr>
+              <w:t xml:space="preserve">Term</w:t>
+            </w:r>
+          </w:p>
+        </w:tc>
+        <w:tc>
+          <w:tcPr>
+            <w:tcW w:type="dxa" w:w="6726"/>
+            <w:shd w:fill="1F3A5F" w:val="clear"/>
+            <w:tcMar>
+              <w:top w:type="dxa" w:w="70"/>
+              <w:left w:type="dxa" w:w="120"/>
+              <w:bottom w:type="dxa" w:w="70"/>
+              <w:right w:type="dxa" w:w="120"/>
+            </w:tcMar>
+          </w:tcPr>
+          <w:p>
+            <w:pPr>
+              <w:keepNext/>
+              <w:spacing w:after="0"/>
+            </w:pPr>
+            <w:r>
+              <w:rPr>
+                <w:b/>
+                <w:bCs/>
+                <w:color w:val="FFFFFF"/>
+                <w:sz w:val="21"/>
+                <w:szCs w:val="21"/>
+              </w:rPr>
+              <w:t xml:space="preserve">In plain words</w:t>
             </w:r>
           </w:p>
         </w:tc>
@@ -4648,7 +4904,7 @@
         </w:trPr>
         <w:tc>
           <w:tcPr>
-            <w:tcW w:type="dxa" w:w="2600"/>
+            <w:tcW w:type="dxa" w:w="2300"/>
             <w:shd w:fill="EDF2F7" w:val="clear"/>
             <w:tcMar>
               <w:top w:type="dxa" w:w="70"/>
@@ -4658,18 +4914,21 @@
             </w:tcMar>
           </w:tcPr>
           <w:p>
-            <w:r>
-              <w:rPr>
-                <w:sz w:val="21"/>
-                <w:szCs w:val="21"/>
-              </w:rPr>
-              <w:t xml:space="preserve">Merge conflict</w:t>
-            </w:r>
-          </w:p>
-        </w:tc>
-        <w:tc>
-          <w:tcPr>
-            <w:tcW w:type="dxa" w:w="6426"/>
+            <w:pPr>
+              <w:spacing w:after="0"/>
+            </w:pPr>
+            <w:r>
+              <w:rPr>
+                <w:sz w:val="21"/>
+                <w:szCs w:val="21"/>
+              </w:rPr>
+              <w:t xml:space="preserve">Connector</w:t>
+            </w:r>
+          </w:p>
+        </w:tc>
+        <w:tc>
+          <w:tcPr>
+            <w:tcW w:type="dxa" w:w="6726"/>
             <w:shd w:fill="EDF2F7" w:val="clear"/>
             <w:tcMar>
               <w:top w:type="dxa" w:w="70"/>
@@ -4679,12 +4938,15 @@
             </w:tcMar>
           </w:tcPr>
           <w:p>
-            <w:r>
-              <w:rPr>
-                <w:sz w:val="21"/>
-                <w:szCs w:val="21"/>
-              </w:rPr>
-              <w:t xml:space="preserve">When two people changed the same lines; Git asks which to keep. Routine.</w:t>
+            <w:pPr>
+              <w:spacing w:after="0"/>
+            </w:pPr>
+            <w:r>
+              <w:rPr>
+                <w:sz w:val="21"/>
+                <w:szCs w:val="21"/>
+              </w:rPr>
+              <w:t xml:space="preserve">A secure bridge between Claude and another app, like mail or a calendar.</w:t>
             </w:r>
           </w:p>
         </w:tc>
@@ -4695,7 +4957,7 @@
         </w:trPr>
         <w:tc>
           <w:tcPr>
-            <w:tcW w:type="dxa" w:w="2600"/>
+            <w:tcW w:type="dxa" w:w="2300"/>
             <w:shd w:fill="FFFFFF" w:val="clear"/>
             <w:tcMar>
               <w:top w:type="dxa" w:w="70"/>
@@ -4705,18 +4967,21 @@
             </w:tcMar>
           </w:tcPr>
           <w:p>
-            <w:r>
-              <w:rPr>
-                <w:sz w:val="21"/>
-                <w:szCs w:val="21"/>
-              </w:rPr>
-              <w:t xml:space="preserve">Pull request</w:t>
-            </w:r>
-          </w:p>
-        </w:tc>
-        <w:tc>
-          <w:tcPr>
-            <w:tcW w:type="dxa" w:w="6426"/>
+            <w:pPr>
+              <w:spacing w:after="0"/>
+            </w:pPr>
+            <w:r>
+              <w:rPr>
+                <w:sz w:val="21"/>
+                <w:szCs w:val="21"/>
+              </w:rPr>
+              <w:t xml:space="preserve">MCP</w:t>
+            </w:r>
+          </w:p>
+        </w:tc>
+        <w:tc>
+          <w:tcPr>
+            <w:tcW w:type="dxa" w:w="6726"/>
             <w:shd w:fill="FFFFFF" w:val="clear"/>
             <w:tcMar>
               <w:top w:type="dxa" w:w="70"/>
@@ -4726,12 +4991,15 @@
             </w:tcMar>
           </w:tcPr>
           <w:p>
-            <w:r>
-              <w:rPr>
-                <w:sz w:val="21"/>
-                <w:szCs w:val="21"/>
-              </w:rPr>
-              <w:t xml:space="preserve">A request to merge your branch into the main version, usually reviewed first.</w:t>
+            <w:pPr>
+              <w:spacing w:after="0"/>
+            </w:pPr>
+            <w:r>
+              <w:rPr>
+                <w:sz w:val="21"/>
+                <w:szCs w:val="21"/>
+              </w:rPr>
+              <w:t xml:space="preserve">The shared standard (Model Context Protocol) that connectors use.</w:t>
             </w:r>
           </w:p>
         </w:tc>
@@ -4742,7 +5010,7 @@
         </w:trPr>
         <w:tc>
           <w:tcPr>
-            <w:tcW w:type="dxa" w:w="2600"/>
+            <w:tcW w:type="dxa" w:w="2300"/>
             <w:shd w:fill="EDF2F7" w:val="clear"/>
             <w:tcMar>
               <w:top w:type="dxa" w:w="70"/>
@@ -4752,18 +5020,21 @@
             </w:tcMar>
           </w:tcPr>
           <w:p>
-            <w:r>
-              <w:rPr>
-                <w:sz w:val="21"/>
-                <w:szCs w:val="21"/>
-              </w:rPr>
-              <w:t xml:space="preserve">GitHub / GitLab</w:t>
-            </w:r>
-          </w:p>
-        </w:tc>
-        <w:tc>
-          <w:tcPr>
-            <w:tcW w:type="dxa" w:w="6426"/>
+            <w:pPr>
+              <w:spacing w:after="0"/>
+            </w:pPr>
+            <w:r>
+              <w:rPr>
+                <w:sz w:val="21"/>
+                <w:szCs w:val="21"/>
+              </w:rPr>
+              <w:t xml:space="preserve">First-party / third-party</w:t>
+            </w:r>
+          </w:p>
+        </w:tc>
+        <w:tc>
+          <w:tcPr>
+            <w:tcW w:type="dxa" w:w="6726"/>
             <w:shd w:fill="EDF2F7" w:val="clear"/>
             <w:tcMar>
               <w:top w:type="dxa" w:w="70"/>
@@ -4773,12 +5044,15 @@
             </w:tcMar>
           </w:tcPr>
           <w:p>
-            <w:r>
-              <w:rPr>
-                <w:sz w:val="21"/>
-                <w:szCs w:val="21"/>
-              </w:rPr>
-              <w:t xml:space="preserve">Websites that host the shared copy of a Git repo so a team can share it.</w:t>
+            <w:pPr>
+              <w:spacing w:after="0"/>
+            </w:pPr>
+            <w:r>
+              <w:rPr>
+                <w:sz w:val="21"/>
+                <w:szCs w:val="21"/>
+              </w:rPr>
+              <w:t xml:space="preserve">Made by Anthropic itself / made by another company.</w:t>
             </w:r>
           </w:p>
         </w:tc>
@@ -4789,7 +5063,7 @@
         </w:trPr>
         <w:tc>
           <w:tcPr>
-            <w:tcW w:type="dxa" w:w="2600"/>
+            <w:tcW w:type="dxa" w:w="2300"/>
             <w:shd w:fill="FFFFFF" w:val="clear"/>
             <w:tcMar>
               <w:top w:type="dxa" w:w="70"/>
@@ -4799,18 +5073,21 @@
             </w:tcMar>
           </w:tcPr>
           <w:p>
-            <w:r>
-              <w:rPr>
-                <w:sz w:val="21"/>
-                <w:szCs w:val="21"/>
-              </w:rPr>
-              <w:t xml:space="preserve">CLAUDE.md</w:t>
-            </w:r>
-          </w:p>
-        </w:tc>
-        <w:tc>
-          <w:tcPr>
-            <w:tcW w:type="dxa" w:w="6426"/>
+            <w:pPr>
+              <w:spacing w:after="0"/>
+            </w:pPr>
+            <w:r>
+              <w:rPr>
+                <w:sz w:val="21"/>
+                <w:szCs w:val="21"/>
+              </w:rPr>
+              <w:t xml:space="preserve">Read-only</w:t>
+            </w:r>
+          </w:p>
+        </w:tc>
+        <w:tc>
+          <w:tcPr>
+            <w:tcW w:type="dxa" w:w="6726"/>
             <w:shd w:fill="FFFFFF" w:val="clear"/>
             <w:tcMar>
               <w:top w:type="dxa" w:w="70"/>
@@ -4820,12 +5097,15 @@
             </w:tcMar>
           </w:tcPr>
           <w:p>
-            <w:r>
-              <w:rPr>
-                <w:sz w:val="21"/>
-                <w:szCs w:val="21"/>
-              </w:rPr>
-              <w:t xml:space="preserve">A file at a Code project's root telling Claude how the project works.</w:t>
+            <w:pPr>
+              <w:spacing w:after="0"/>
+            </w:pPr>
+            <w:r>
+              <w:rPr>
+                <w:sz w:val="21"/>
+                <w:szCs w:val="21"/>
+              </w:rPr>
+              <w:t xml:space="preserve">Claude can look, but not send or change anything.</w:t>
             </w:r>
           </w:p>
         </w:tc>
@@ -4836,7 +5116,7 @@
         </w:trPr>
         <w:tc>
           <w:tcPr>
-            <w:tcW w:type="dxa" w:w="2600"/>
+            <w:tcW w:type="dxa" w:w="2300"/>
             <w:shd w:fill="EDF2F7" w:val="clear"/>
             <w:tcMar>
               <w:top w:type="dxa" w:w="70"/>
@@ -4846,18 +5126,21 @@
             </w:tcMar>
           </w:tcPr>
           <w:p>
-            <w:r>
-              <w:rPr>
-                <w:sz w:val="21"/>
-                <w:szCs w:val="21"/>
-              </w:rPr>
-              <w:t xml:space="preserve">MCP</w:t>
-            </w:r>
-          </w:p>
-        </w:tc>
-        <w:tc>
-          <w:tcPr>
-            <w:tcW w:type="dxa" w:w="6426"/>
+            <w:pPr>
+              <w:spacing w:after="0"/>
+            </w:pPr>
+            <w:r>
+              <w:rPr>
+                <w:sz w:val="21"/>
+                <w:szCs w:val="21"/>
+              </w:rPr>
+              <w:t xml:space="preserve">GDPR</w:t>
+            </w:r>
+          </w:p>
+        </w:tc>
+        <w:tc>
+          <w:tcPr>
+            <w:tcW w:type="dxa" w:w="6726"/>
             <w:shd w:fill="EDF2F7" w:val="clear"/>
             <w:tcMar>
               <w:top w:type="dxa" w:w="70"/>
@@ -4867,12 +5150,15 @@
             </w:tcMar>
           </w:tcPr>
           <w:p>
-            <w:r>
-              <w:rPr>
-                <w:sz w:val="21"/>
-                <w:szCs w:val="21"/>
-              </w:rPr>
-              <w:t xml:space="preserve">The shared standard connectors use to link Claude to other apps.</w:t>
+            <w:pPr>
+              <w:spacing w:after="0"/>
+            </w:pPr>
+            <w:r>
+              <w:rPr>
+                <w:sz w:val="21"/>
+                <w:szCs w:val="21"/>
+              </w:rPr>
+              <w:t xml:space="preserve">The EU rules for handling personal data: anything that identifies a living person.</w:t>
             </w:r>
           </w:p>
         </w:tc>
@@ -4883,7 +5169,7 @@
         </w:trPr>
         <w:tc>
           <w:tcPr>
-            <w:tcW w:type="dxa" w:w="2600"/>
+            <w:tcW w:type="dxa" w:w="2300"/>
             <w:shd w:fill="FFFFFF" w:val="clear"/>
             <w:tcMar>
               <w:top w:type="dxa" w:w="70"/>
@@ -4893,18 +5179,21 @@
             </w:tcMar>
           </w:tcPr>
           <w:p>
-            <w:r>
-              <w:rPr>
-                <w:sz w:val="21"/>
-                <w:szCs w:val="21"/>
-              </w:rPr>
-              <w:t xml:space="preserve">GDPR</w:t>
-            </w:r>
-          </w:p>
-        </w:tc>
-        <w:tc>
-          <w:tcPr>
-            <w:tcW w:type="dxa" w:w="6426"/>
+            <w:pPr>
+              <w:spacing w:after="0"/>
+            </w:pPr>
+            <w:r>
+              <w:rPr>
+                <w:sz w:val="21"/>
+                <w:szCs w:val="21"/>
+              </w:rPr>
+              <w:t xml:space="preserve">Anonymise / redact</w:t>
+            </w:r>
+          </w:p>
+        </w:tc>
+        <w:tc>
+          <w:tcPr>
+            <w:tcW w:type="dxa" w:w="6726"/>
             <w:shd w:fill="FFFFFF" w:val="clear"/>
             <w:tcMar>
               <w:top w:type="dxa" w:w="70"/>
@@ -4914,12 +5203,15 @@
             </w:tcMar>
           </w:tcPr>
           <w:p>
-            <w:r>
-              <w:rPr>
-                <w:sz w:val="21"/>
-                <w:szCs w:val="21"/>
-              </w:rPr>
-              <w:t xml:space="preserve">The EU rules for handling personal data — anything that identifies a living person.</w:t>
+            <w:pPr>
+              <w:spacing w:after="0"/>
+            </w:pPr>
+            <w:r>
+              <w:rPr>
+                <w:sz w:val="21"/>
+                <w:szCs w:val="21"/>
+              </w:rPr>
+              <w:t xml:space="preserve">Remove names and details that identify people.</w:t>
             </w:r>
           </w:p>
         </w:tc>
@@ -4930,7 +5222,7 @@
         </w:trPr>
         <w:tc>
           <w:tcPr>
-            <w:tcW w:type="dxa" w:w="2600"/>
+            <w:tcW w:type="dxa" w:w="2300"/>
             <w:shd w:fill="EDF2F7" w:val="clear"/>
             <w:tcMar>
               <w:top w:type="dxa" w:w="70"/>
@@ -4940,18 +5232,21 @@
             </w:tcMar>
           </w:tcPr>
           <w:p>
-            <w:r>
-              <w:rPr>
-                <w:sz w:val="21"/>
-                <w:szCs w:val="21"/>
-              </w:rPr>
-              <w:t xml:space="preserve">Agent</w:t>
-            </w:r>
-          </w:p>
-        </w:tc>
-        <w:tc>
-          <w:tcPr>
-            <w:tcW w:type="dxa" w:w="6426"/>
+            <w:pPr>
+              <w:spacing w:after="0"/>
+            </w:pPr>
+            <w:r>
+              <w:rPr>
+                <w:sz w:val="21"/>
+                <w:szCs w:val="21"/>
+              </w:rPr>
+              <w:t xml:space="preserve">Data-protection officer</w:t>
+            </w:r>
+          </w:p>
+        </w:tc>
+        <w:tc>
+          <w:tcPr>
+            <w:tcW w:type="dxa" w:w="6726"/>
             <w:shd w:fill="EDF2F7" w:val="clear"/>
             <w:tcMar>
               <w:top w:type="dxa" w:w="70"/>
@@ -4961,12 +5256,68 @@
             </w:tcMar>
           </w:tcPr>
           <w:p>
-            <w:r>
-              <w:rPr>
-                <w:sz w:val="21"/>
-                <w:szCs w:val="21"/>
-              </w:rPr>
-              <w:t xml:space="preserve">Claude working toward a goal across several steps, often scheduled, reporting back.</w:t>
+            <w:pPr>
+              <w:spacing w:after="0"/>
+            </w:pPr>
+            <w:r>
+              <w:rPr>
+                <w:sz w:val="21"/>
+                <w:szCs w:val="21"/>
+              </w:rPr>
+              <w:t xml:space="preserve">The person in your organisation responsible for personal data.</w:t>
+            </w:r>
+          </w:p>
+        </w:tc>
+      </w:tr>
+      <w:tr>
+        <w:trPr>
+          <w:cantSplit/>
+        </w:trPr>
+        <w:tc>
+          <w:tcPr>
+            <w:tcW w:type="dxa" w:w="2300"/>
+            <w:shd w:fill="FFFFFF" w:val="clear"/>
+            <w:tcMar>
+              <w:top w:type="dxa" w:w="70"/>
+              <w:left w:type="dxa" w:w="120"/>
+              <w:bottom w:type="dxa" w:w="70"/>
+              <w:right w:type="dxa" w:w="120"/>
+            </w:tcMar>
+          </w:tcPr>
+          <w:p>
+            <w:pPr>
+              <w:spacing w:after="0"/>
+            </w:pPr>
+            <w:r>
+              <w:rPr>
+                <w:sz w:val="21"/>
+                <w:szCs w:val="21"/>
+              </w:rPr>
+              <w:t xml:space="preserve">Retention</w:t>
+            </w:r>
+          </w:p>
+        </w:tc>
+        <w:tc>
+          <w:tcPr>
+            <w:tcW w:type="dxa" w:w="6726"/>
+            <w:shd w:fill="FFFFFF" w:val="clear"/>
+            <w:tcMar>
+              <w:top w:type="dxa" w:w="70"/>
+              <w:left w:type="dxa" w:w="120"/>
+              <w:bottom w:type="dxa" w:w="70"/>
+              <w:right w:type="dxa" w:w="120"/>
+            </w:tcMar>
+          </w:tcPr>
+          <w:p>
+            <w:pPr>
+              <w:spacing w:after="0"/>
+            </w:pPr>
+            <w:r>
+              <w:rPr>
+                <w:sz w:val="21"/>
+                <w:szCs w:val="21"/>
+              </w:rPr>
+              <w:t xml:space="preserve">How long your data is kept.</w:t>
             </w:r>
           </w:p>
         </w:tc>
@@ -4974,6 +5325,1061 @@
     </w:tbl>
     <w:p>
       <w:pPr>
+        <w:spacing w:after="80" w:line="120" w:lineRule="exact"/>
+      </w:pPr>
+    </w:p>
+    <w:p>
+      <w:pPr>
+        <w:keepNext/>
+        <w:keepLines/>
+        <w:spacing w:before="160" w:after="60"/>
+      </w:pPr>
+      <w:r>
+        <w:rPr>
+          <w:b/>
+          <w:bCs/>
+          <w:color w:val="1F3A5F"/>
+          <w:sz w:val="24"/>
+          <w:szCs w:val="24"/>
+        </w:rPr>
+        <w:t xml:space="preserve">Git and teamwork</w:t>
+      </w:r>
+    </w:p>
+    <w:tbl>
+      <w:tblPr>
+        <w:tblW w:type="dxa" w:w="9026"/>
+        <w:tblBorders>
+          <w:top w:val="single" w:color="CCCCCC" w:sz="1"/>
+          <w:left w:val="single" w:color="CCCCCC" w:sz="1"/>
+          <w:bottom w:val="single" w:color="CCCCCC" w:sz="1"/>
+          <w:right w:val="single" w:color="CCCCCC" w:sz="1"/>
+          <w:insideH w:val="single" w:color="CCCCCC" w:sz="1"/>
+          <w:insideV w:val="single" w:color="CCCCCC" w:sz="1"/>
+        </w:tblBorders>
+      </w:tblPr>
+      <w:tblGrid>
+        <w:gridCol w:w="2300"/>
+        <w:gridCol w:w="6726"/>
+      </w:tblGrid>
+      <w:tr>
+        <w:trPr>
+          <w:cantSplit/>
+          <w:tblHeader/>
+        </w:trPr>
+        <w:tc>
+          <w:tcPr>
+            <w:tcW w:type="dxa" w:w="2300"/>
+            <w:shd w:fill="1F3A5F" w:val="clear"/>
+            <w:tcMar>
+              <w:top w:type="dxa" w:w="70"/>
+              <w:left w:type="dxa" w:w="120"/>
+              <w:bottom w:type="dxa" w:w="70"/>
+              <w:right w:type="dxa" w:w="120"/>
+            </w:tcMar>
+          </w:tcPr>
+          <w:p>
+            <w:pPr>
+              <w:keepNext/>
+              <w:spacing w:after="0"/>
+            </w:pPr>
+            <w:r>
+              <w:rPr>
+                <w:b/>
+                <w:bCs/>
+                <w:color w:val="FFFFFF"/>
+                <w:sz w:val="21"/>
+                <w:szCs w:val="21"/>
+              </w:rPr>
+              <w:t xml:space="preserve">Term</w:t>
+            </w:r>
+          </w:p>
+        </w:tc>
+        <w:tc>
+          <w:tcPr>
+            <w:tcW w:type="dxa" w:w="6726"/>
+            <w:shd w:fill="1F3A5F" w:val="clear"/>
+            <w:tcMar>
+              <w:top w:type="dxa" w:w="70"/>
+              <w:left w:type="dxa" w:w="120"/>
+              <w:bottom w:type="dxa" w:w="70"/>
+              <w:right w:type="dxa" w:w="120"/>
+            </w:tcMar>
+          </w:tcPr>
+          <w:p>
+            <w:pPr>
+              <w:keepNext/>
+              <w:spacing w:after="0"/>
+            </w:pPr>
+            <w:r>
+              <w:rPr>
+                <w:b/>
+                <w:bCs/>
+                <w:color w:val="FFFFFF"/>
+                <w:sz w:val="21"/>
+                <w:szCs w:val="21"/>
+              </w:rPr>
+              <w:t xml:space="preserve">In plain words</w:t>
+            </w:r>
+          </w:p>
+        </w:tc>
+      </w:tr>
+      <w:tr>
+        <w:trPr>
+          <w:cantSplit/>
+        </w:trPr>
+        <w:tc>
+          <w:tcPr>
+            <w:tcW w:type="dxa" w:w="2300"/>
+            <w:shd w:fill="EDF2F7" w:val="clear"/>
+            <w:tcMar>
+              <w:top w:type="dxa" w:w="70"/>
+              <w:left w:type="dxa" w:w="120"/>
+              <w:bottom w:type="dxa" w:w="70"/>
+              <w:right w:type="dxa" w:w="120"/>
+            </w:tcMar>
+          </w:tcPr>
+          <w:p>
+            <w:pPr>
+              <w:spacing w:after="0"/>
+            </w:pPr>
+            <w:r>
+              <w:rPr>
+                <w:sz w:val="21"/>
+                <w:szCs w:val="21"/>
+              </w:rPr>
+              <w:t xml:space="preserve">Repository (repo)</w:t>
+            </w:r>
+          </w:p>
+        </w:tc>
+        <w:tc>
+          <w:tcPr>
+            <w:tcW w:type="dxa" w:w="6726"/>
+            <w:shd w:fill="EDF2F7" w:val="clear"/>
+            <w:tcMar>
+              <w:top w:type="dxa" w:w="70"/>
+              <w:left w:type="dxa" w:w="120"/>
+              <w:bottom w:type="dxa" w:w="70"/>
+              <w:right w:type="dxa" w:w="120"/>
+            </w:tcMar>
+          </w:tcPr>
+          <w:p>
+            <w:pPr>
+              <w:spacing w:after="0"/>
+            </w:pPr>
+            <w:r>
+              <w:rPr>
+                <w:sz w:val="21"/>
+                <w:szCs w:val="21"/>
+              </w:rPr>
+              <w:t xml:space="preserve">A project folder plus its full history of saved snapshots, managed by Git.</w:t>
+            </w:r>
+          </w:p>
+        </w:tc>
+      </w:tr>
+      <w:tr>
+        <w:trPr>
+          <w:cantSplit/>
+        </w:trPr>
+        <w:tc>
+          <w:tcPr>
+            <w:tcW w:type="dxa" w:w="2300"/>
+            <w:shd w:fill="FFFFFF" w:val="clear"/>
+            <w:tcMar>
+              <w:top w:type="dxa" w:w="70"/>
+              <w:left w:type="dxa" w:w="120"/>
+              <w:bottom w:type="dxa" w:w="70"/>
+              <w:right w:type="dxa" w:w="120"/>
+            </w:tcMar>
+          </w:tcPr>
+          <w:p>
+            <w:pPr>
+              <w:spacing w:after="0"/>
+            </w:pPr>
+            <w:r>
+              <w:rPr>
+                <w:sz w:val="21"/>
+                <w:szCs w:val="21"/>
+              </w:rPr>
+              <w:t xml:space="preserve">Commit</w:t>
+            </w:r>
+          </w:p>
+        </w:tc>
+        <w:tc>
+          <w:tcPr>
+            <w:tcW w:type="dxa" w:w="6726"/>
+            <w:shd w:fill="FFFFFF" w:val="clear"/>
+            <w:tcMar>
+              <w:top w:type="dxa" w:w="70"/>
+              <w:left w:type="dxa" w:w="120"/>
+              <w:bottom w:type="dxa" w:w="70"/>
+              <w:right w:type="dxa" w:w="120"/>
+            </w:tcMar>
+          </w:tcPr>
+          <w:p>
+            <w:pPr>
+              <w:spacing w:after="0"/>
+            </w:pPr>
+            <w:r>
+              <w:rPr>
+                <w:sz w:val="21"/>
+                <w:szCs w:val="21"/>
+              </w:rPr>
+              <w:t xml:space="preserve">One saved snapshot, with a short message describing the change.</w:t>
+            </w:r>
+          </w:p>
+        </w:tc>
+      </w:tr>
+      <w:tr>
+        <w:trPr>
+          <w:cantSplit/>
+        </w:trPr>
+        <w:tc>
+          <w:tcPr>
+            <w:tcW w:type="dxa" w:w="2300"/>
+            <w:shd w:fill="EDF2F7" w:val="clear"/>
+            <w:tcMar>
+              <w:top w:type="dxa" w:w="70"/>
+              <w:left w:type="dxa" w:w="120"/>
+              <w:bottom w:type="dxa" w:w="70"/>
+              <w:right w:type="dxa" w:w="120"/>
+            </w:tcMar>
+          </w:tcPr>
+          <w:p>
+            <w:pPr>
+              <w:spacing w:after="0"/>
+            </w:pPr>
+            <w:r>
+              <w:rPr>
+                <w:sz w:val="21"/>
+                <w:szCs w:val="21"/>
+              </w:rPr>
+              <w:t xml:space="preserve">Push / Pull</w:t>
+            </w:r>
+          </w:p>
+        </w:tc>
+        <w:tc>
+          <w:tcPr>
+            <w:tcW w:type="dxa" w:w="6726"/>
+            <w:shd w:fill="EDF2F7" w:val="clear"/>
+            <w:tcMar>
+              <w:top w:type="dxa" w:w="70"/>
+              <w:left w:type="dxa" w:w="120"/>
+              <w:bottom w:type="dxa" w:w="70"/>
+              <w:right w:type="dxa" w:w="120"/>
+            </w:tcMar>
+          </w:tcPr>
+          <w:p>
+            <w:pPr>
+              <w:spacing w:after="0"/>
+            </w:pPr>
+            <w:r>
+              <w:rPr>
+                <w:sz w:val="21"/>
+                <w:szCs w:val="21"/>
+              </w:rPr>
+              <w:t xml:space="preserve">Send your commits to the shared online copy / bring others' down to yours.</w:t>
+            </w:r>
+          </w:p>
+        </w:tc>
+      </w:tr>
+      <w:tr>
+        <w:trPr>
+          <w:cantSplit/>
+        </w:trPr>
+        <w:tc>
+          <w:tcPr>
+            <w:tcW w:type="dxa" w:w="2300"/>
+            <w:shd w:fill="FFFFFF" w:val="clear"/>
+            <w:tcMar>
+              <w:top w:type="dxa" w:w="70"/>
+              <w:left w:type="dxa" w:w="120"/>
+              <w:bottom w:type="dxa" w:w="70"/>
+              <w:right w:type="dxa" w:w="120"/>
+            </w:tcMar>
+          </w:tcPr>
+          <w:p>
+            <w:pPr>
+              <w:spacing w:after="0"/>
+            </w:pPr>
+            <w:r>
+              <w:rPr>
+                <w:sz w:val="21"/>
+                <w:szCs w:val="21"/>
+              </w:rPr>
+              <w:t xml:space="preserve">Branch</w:t>
+            </w:r>
+          </w:p>
+        </w:tc>
+        <w:tc>
+          <w:tcPr>
+            <w:tcW w:type="dxa" w:w="6726"/>
+            <w:shd w:fill="FFFFFF" w:val="clear"/>
+            <w:tcMar>
+              <w:top w:type="dxa" w:w="70"/>
+              <w:left w:type="dxa" w:w="120"/>
+              <w:bottom w:type="dxa" w:w="70"/>
+              <w:right w:type="dxa" w:w="120"/>
+            </w:tcMar>
+          </w:tcPr>
+          <w:p>
+            <w:pPr>
+              <w:spacing w:after="0"/>
+            </w:pPr>
+            <w:r>
+              <w:rPr>
+                <w:sz w:val="21"/>
+                <w:szCs w:val="21"/>
+              </w:rPr>
+              <w:t xml:space="preserve">A safe side-track to try changes without touching the main version.</w:t>
+            </w:r>
+          </w:p>
+        </w:tc>
+      </w:tr>
+      <w:tr>
+        <w:trPr>
+          <w:cantSplit/>
+        </w:trPr>
+        <w:tc>
+          <w:tcPr>
+            <w:tcW w:type="dxa" w:w="2300"/>
+            <w:shd w:fill="EDF2F7" w:val="clear"/>
+            <w:tcMar>
+              <w:top w:type="dxa" w:w="70"/>
+              <w:left w:type="dxa" w:w="120"/>
+              <w:bottom w:type="dxa" w:w="70"/>
+              <w:right w:type="dxa" w:w="120"/>
+            </w:tcMar>
+          </w:tcPr>
+          <w:p>
+            <w:pPr>
+              <w:spacing w:after="0"/>
+            </w:pPr>
+            <w:r>
+              <w:rPr>
+                <w:sz w:val="21"/>
+                <w:szCs w:val="21"/>
+              </w:rPr>
+              <w:t xml:space="preserve">Pull request</w:t>
+            </w:r>
+          </w:p>
+        </w:tc>
+        <w:tc>
+          <w:tcPr>
+            <w:tcW w:type="dxa" w:w="6726"/>
+            <w:shd w:fill="EDF2F7" w:val="clear"/>
+            <w:tcMar>
+              <w:top w:type="dxa" w:w="70"/>
+              <w:left w:type="dxa" w:w="120"/>
+              <w:bottom w:type="dxa" w:w="70"/>
+              <w:right w:type="dxa" w:w="120"/>
+            </w:tcMar>
+          </w:tcPr>
+          <w:p>
+            <w:pPr>
+              <w:spacing w:after="0"/>
+            </w:pPr>
+            <w:r>
+              <w:rPr>
+                <w:sz w:val="21"/>
+                <w:szCs w:val="21"/>
+              </w:rPr>
+              <w:t xml:space="preserve">A request to merge your branch into the main version, usually reviewed first.</w:t>
+            </w:r>
+          </w:p>
+        </w:tc>
+      </w:tr>
+      <w:tr>
+        <w:trPr>
+          <w:cantSplit/>
+        </w:trPr>
+        <w:tc>
+          <w:tcPr>
+            <w:tcW w:type="dxa" w:w="2300"/>
+            <w:shd w:fill="FFFFFF" w:val="clear"/>
+            <w:tcMar>
+              <w:top w:type="dxa" w:w="70"/>
+              <w:left w:type="dxa" w:w="120"/>
+              <w:bottom w:type="dxa" w:w="70"/>
+              <w:right w:type="dxa" w:w="120"/>
+            </w:tcMar>
+          </w:tcPr>
+          <w:p>
+            <w:pPr>
+              <w:spacing w:after="0"/>
+            </w:pPr>
+            <w:r>
+              <w:rPr>
+                <w:sz w:val="21"/>
+                <w:szCs w:val="21"/>
+              </w:rPr>
+              <w:t xml:space="preserve">Merge conflict</w:t>
+            </w:r>
+          </w:p>
+        </w:tc>
+        <w:tc>
+          <w:tcPr>
+            <w:tcW w:type="dxa" w:w="6726"/>
+            <w:shd w:fill="FFFFFF" w:val="clear"/>
+            <w:tcMar>
+              <w:top w:type="dxa" w:w="70"/>
+              <w:left w:type="dxa" w:w="120"/>
+              <w:bottom w:type="dxa" w:w="70"/>
+              <w:right w:type="dxa" w:w="120"/>
+            </w:tcMar>
+          </w:tcPr>
+          <w:p>
+            <w:pPr>
+              <w:spacing w:after="0"/>
+            </w:pPr>
+            <w:r>
+              <w:rPr>
+                <w:sz w:val="21"/>
+                <w:szCs w:val="21"/>
+              </w:rPr>
+              <w:t xml:space="preserve">When two people changed the same lines; Git asks which to keep. Routine.</w:t>
+            </w:r>
+          </w:p>
+        </w:tc>
+      </w:tr>
+      <w:tr>
+        <w:trPr>
+          <w:cantSplit/>
+        </w:trPr>
+        <w:tc>
+          <w:tcPr>
+            <w:tcW w:type="dxa" w:w="2300"/>
+            <w:shd w:fill="EDF2F7" w:val="clear"/>
+            <w:tcMar>
+              <w:top w:type="dxa" w:w="70"/>
+              <w:left w:type="dxa" w:w="120"/>
+              <w:bottom w:type="dxa" w:w="70"/>
+              <w:right w:type="dxa" w:w="120"/>
+            </w:tcMar>
+          </w:tcPr>
+          <w:p>
+            <w:pPr>
+              <w:spacing w:after="0"/>
+            </w:pPr>
+            <w:r>
+              <w:rPr>
+                <w:sz w:val="21"/>
+                <w:szCs w:val="21"/>
+              </w:rPr>
+              <w:t xml:space="preserve">Clone</w:t>
+            </w:r>
+          </w:p>
+        </w:tc>
+        <w:tc>
+          <w:tcPr>
+            <w:tcW w:type="dxa" w:w="6726"/>
+            <w:shd w:fill="EDF2F7" w:val="clear"/>
+            <w:tcMar>
+              <w:top w:type="dxa" w:w="70"/>
+              <w:left w:type="dxa" w:w="120"/>
+              <w:bottom w:type="dxa" w:w="70"/>
+              <w:right w:type="dxa" w:w="120"/>
+            </w:tcMar>
+          </w:tcPr>
+          <w:p>
+            <w:pPr>
+              <w:spacing w:after="0"/>
+            </w:pPr>
+            <w:r>
+              <w:rPr>
+                <w:sz w:val="21"/>
+                <w:szCs w:val="21"/>
+              </w:rPr>
+              <w:t xml:space="preserve">Make your own local copy of a shared repo.</w:t>
+            </w:r>
+          </w:p>
+        </w:tc>
+      </w:tr>
+      <w:tr>
+        <w:trPr>
+          <w:cantSplit/>
+        </w:trPr>
+        <w:tc>
+          <w:tcPr>
+            <w:tcW w:type="dxa" w:w="2300"/>
+            <w:shd w:fill="FFFFFF" w:val="clear"/>
+            <w:tcMar>
+              <w:top w:type="dxa" w:w="70"/>
+              <w:left w:type="dxa" w:w="120"/>
+              <w:bottom w:type="dxa" w:w="70"/>
+              <w:right w:type="dxa" w:w="120"/>
+            </w:tcMar>
+          </w:tcPr>
+          <w:p>
+            <w:pPr>
+              <w:spacing w:after="0"/>
+            </w:pPr>
+            <w:r>
+              <w:rPr>
+                <w:sz w:val="21"/>
+                <w:szCs w:val="21"/>
+              </w:rPr>
+              <w:t xml:space="preserve">GitHub / GitLab</w:t>
+            </w:r>
+          </w:p>
+        </w:tc>
+        <w:tc>
+          <w:tcPr>
+            <w:tcW w:type="dxa" w:w="6726"/>
+            <w:shd w:fill="FFFFFF" w:val="clear"/>
+            <w:tcMar>
+              <w:top w:type="dxa" w:w="70"/>
+              <w:left w:type="dxa" w:w="120"/>
+              <w:bottom w:type="dxa" w:w="70"/>
+              <w:right w:type="dxa" w:w="120"/>
+            </w:tcMar>
+          </w:tcPr>
+          <w:p>
+            <w:pPr>
+              <w:spacing w:after="0"/>
+            </w:pPr>
+            <w:r>
+              <w:rPr>
+                <w:sz w:val="21"/>
+                <w:szCs w:val="21"/>
+              </w:rPr>
+              <w:t xml:space="preserve">Websites that host the shared copy of a Git repo so a team can share it.</w:t>
+            </w:r>
+          </w:p>
+        </w:tc>
+      </w:tr>
+    </w:tbl>
+    <w:p>
+      <w:pPr>
+        <w:spacing w:after="80" w:line="120" w:lineRule="exact"/>
+      </w:pPr>
+    </w:p>
+    <w:p>
+      <w:pPr>
+        <w:keepNext/>
+        <w:keepLines/>
+        <w:spacing w:before="160" w:after="60"/>
+      </w:pPr>
+      <w:r>
+        <w:rPr>
+          <w:b/>
+          <w:bCs/>
+          <w:color w:val="1F3A5F"/>
+          <w:sz w:val="24"/>
+          <w:szCs w:val="24"/>
+        </w:rPr>
+        <w:t xml:space="preserve">Code and agents</w:t>
+      </w:r>
+    </w:p>
+    <w:tbl>
+      <w:tblPr>
+        <w:tblW w:type="dxa" w:w="9026"/>
+        <w:tblBorders>
+          <w:top w:val="single" w:color="CCCCCC" w:sz="1"/>
+          <w:left w:val="single" w:color="CCCCCC" w:sz="1"/>
+          <w:bottom w:val="single" w:color="CCCCCC" w:sz="1"/>
+          <w:right w:val="single" w:color="CCCCCC" w:sz="1"/>
+          <w:insideH w:val="single" w:color="CCCCCC" w:sz="1"/>
+          <w:insideV w:val="single" w:color="CCCCCC" w:sz="1"/>
+        </w:tblBorders>
+      </w:tblPr>
+      <w:tblGrid>
+        <w:gridCol w:w="2300"/>
+        <w:gridCol w:w="6726"/>
+      </w:tblGrid>
+      <w:tr>
+        <w:trPr>
+          <w:cantSplit/>
+          <w:tblHeader/>
+        </w:trPr>
+        <w:tc>
+          <w:tcPr>
+            <w:tcW w:type="dxa" w:w="2300"/>
+            <w:shd w:fill="1F3A5F" w:val="clear"/>
+            <w:tcMar>
+              <w:top w:type="dxa" w:w="70"/>
+              <w:left w:type="dxa" w:w="120"/>
+              <w:bottom w:type="dxa" w:w="70"/>
+              <w:right w:type="dxa" w:w="120"/>
+            </w:tcMar>
+          </w:tcPr>
+          <w:p>
+            <w:pPr>
+              <w:keepNext/>
+              <w:spacing w:after="0"/>
+            </w:pPr>
+            <w:r>
+              <w:rPr>
+                <w:b/>
+                <w:bCs/>
+                <w:color w:val="FFFFFF"/>
+                <w:sz w:val="21"/>
+                <w:szCs w:val="21"/>
+              </w:rPr>
+              <w:t xml:space="preserve">Term</w:t>
+            </w:r>
+          </w:p>
+        </w:tc>
+        <w:tc>
+          <w:tcPr>
+            <w:tcW w:type="dxa" w:w="6726"/>
+            <w:shd w:fill="1F3A5F" w:val="clear"/>
+            <w:tcMar>
+              <w:top w:type="dxa" w:w="70"/>
+              <w:left w:type="dxa" w:w="120"/>
+              <w:bottom w:type="dxa" w:w="70"/>
+              <w:right w:type="dxa" w:w="120"/>
+            </w:tcMar>
+          </w:tcPr>
+          <w:p>
+            <w:pPr>
+              <w:keepNext/>
+              <w:spacing w:after="0"/>
+            </w:pPr>
+            <w:r>
+              <w:rPr>
+                <w:b/>
+                <w:bCs/>
+                <w:color w:val="FFFFFF"/>
+                <w:sz w:val="21"/>
+                <w:szCs w:val="21"/>
+              </w:rPr>
+              <w:t xml:space="preserve">In plain words</w:t>
+            </w:r>
+          </w:p>
+        </w:tc>
+      </w:tr>
+      <w:tr>
+        <w:trPr>
+          <w:cantSplit/>
+        </w:trPr>
+        <w:tc>
+          <w:tcPr>
+            <w:tcW w:type="dxa" w:w="2300"/>
+            <w:shd w:fill="EDF2F7" w:val="clear"/>
+            <w:tcMar>
+              <w:top w:type="dxa" w:w="70"/>
+              <w:left w:type="dxa" w:w="120"/>
+              <w:bottom w:type="dxa" w:w="70"/>
+              <w:right w:type="dxa" w:w="120"/>
+            </w:tcMar>
+          </w:tcPr>
+          <w:p>
+            <w:pPr>
+              <w:spacing w:after="0"/>
+            </w:pPr>
+            <w:r>
+              <w:rPr>
+                <w:sz w:val="21"/>
+                <w:szCs w:val="21"/>
+              </w:rPr>
+              <w:t xml:space="preserve">Claude Code</w:t>
+            </w:r>
+          </w:p>
+        </w:tc>
+        <w:tc>
+          <w:tcPr>
+            <w:tcW w:type="dxa" w:w="6726"/>
+            <w:shd w:fill="EDF2F7" w:val="clear"/>
+            <w:tcMar>
+              <w:top w:type="dxa" w:w="70"/>
+              <w:left w:type="dxa" w:w="120"/>
+              <w:bottom w:type="dxa" w:w="70"/>
+              <w:right w:type="dxa" w:w="120"/>
+            </w:tcMar>
+          </w:tcPr>
+          <w:p>
+            <w:pPr>
+              <w:spacing w:after="0"/>
+            </w:pPr>
+            <w:r>
+              <w:rPr>
+                <w:sz w:val="21"/>
+                <w:szCs w:val="21"/>
+              </w:rPr>
+              <w:t xml:space="preserve">Claude that writes and runs real software on your PC.</w:t>
+            </w:r>
+          </w:p>
+        </w:tc>
+      </w:tr>
+      <w:tr>
+        <w:trPr>
+          <w:cantSplit/>
+        </w:trPr>
+        <w:tc>
+          <w:tcPr>
+            <w:tcW w:type="dxa" w:w="2300"/>
+            <w:shd w:fill="FFFFFF" w:val="clear"/>
+            <w:tcMar>
+              <w:top w:type="dxa" w:w="70"/>
+              <w:left w:type="dxa" w:w="120"/>
+              <w:bottom w:type="dxa" w:w="70"/>
+              <w:right w:type="dxa" w:w="120"/>
+            </w:tcMar>
+          </w:tcPr>
+          <w:p>
+            <w:pPr>
+              <w:spacing w:after="0"/>
+            </w:pPr>
+            <w:r>
+              <w:rPr>
+                <w:sz w:val="21"/>
+                <w:szCs w:val="21"/>
+              </w:rPr>
+              <w:t xml:space="preserve">CLAUDE.md</w:t>
+            </w:r>
+          </w:p>
+        </w:tc>
+        <w:tc>
+          <w:tcPr>
+            <w:tcW w:type="dxa" w:w="6726"/>
+            <w:shd w:fill="FFFFFF" w:val="clear"/>
+            <w:tcMar>
+              <w:top w:type="dxa" w:w="70"/>
+              <w:left w:type="dxa" w:w="120"/>
+              <w:bottom w:type="dxa" w:w="70"/>
+              <w:right w:type="dxa" w:w="120"/>
+            </w:tcMar>
+          </w:tcPr>
+          <w:p>
+            <w:pPr>
+              <w:spacing w:after="0"/>
+            </w:pPr>
+            <w:r>
+              <w:rPr>
+                <w:sz w:val="21"/>
+                <w:szCs w:val="21"/>
+              </w:rPr>
+              <w:t xml:space="preserve">A file at a Code project's root telling Claude how the project works.</w:t>
+            </w:r>
+          </w:p>
+        </w:tc>
+      </w:tr>
+      <w:tr>
+        <w:trPr>
+          <w:cantSplit/>
+        </w:trPr>
+        <w:tc>
+          <w:tcPr>
+            <w:tcW w:type="dxa" w:w="2300"/>
+            <w:shd w:fill="EDF2F7" w:val="clear"/>
+            <w:tcMar>
+              <w:top w:type="dxa" w:w="70"/>
+              <w:left w:type="dxa" w:w="120"/>
+              <w:bottom w:type="dxa" w:w="70"/>
+              <w:right w:type="dxa" w:w="120"/>
+            </w:tcMar>
+          </w:tcPr>
+          <w:p>
+            <w:pPr>
+              <w:spacing w:after="0"/>
+            </w:pPr>
+            <w:r>
+              <w:rPr>
+                <w:sz w:val="21"/>
+                <w:szCs w:val="21"/>
+              </w:rPr>
+              <w:t xml:space="preserve">Permissions</w:t>
+            </w:r>
+          </w:p>
+        </w:tc>
+        <w:tc>
+          <w:tcPr>
+            <w:tcW w:type="dxa" w:w="6726"/>
+            <w:shd w:fill="EDF2F7" w:val="clear"/>
+            <w:tcMar>
+              <w:top w:type="dxa" w:w="70"/>
+              <w:left w:type="dxa" w:w="120"/>
+              <w:bottom w:type="dxa" w:w="70"/>
+              <w:right w:type="dxa" w:w="120"/>
+            </w:tcMar>
+          </w:tcPr>
+          <w:p>
+            <w:pPr>
+              <w:spacing w:after="0"/>
+            </w:pPr>
+            <w:r>
+              <w:rPr>
+                <w:sz w:val="21"/>
+                <w:szCs w:val="21"/>
+              </w:rPr>
+              <w:t xml:space="preserve">How much Claude may do without asking: ask every time, auto-accept edits, or bypass all.</w:t>
+            </w:r>
+          </w:p>
+        </w:tc>
+      </w:tr>
+      <w:tr>
+        <w:trPr>
+          <w:cantSplit/>
+        </w:trPr>
+        <w:tc>
+          <w:tcPr>
+            <w:tcW w:type="dxa" w:w="2300"/>
+            <w:shd w:fill="FFFFFF" w:val="clear"/>
+            <w:tcMar>
+              <w:top w:type="dxa" w:w="70"/>
+              <w:left w:type="dxa" w:w="120"/>
+              <w:bottom w:type="dxa" w:w="70"/>
+              <w:right w:type="dxa" w:w="120"/>
+            </w:tcMar>
+          </w:tcPr>
+          <w:p>
+            <w:pPr>
+              <w:spacing w:after="0"/>
+            </w:pPr>
+            <w:r>
+              <w:rPr>
+                <w:sz w:val="21"/>
+                <w:szCs w:val="21"/>
+              </w:rPr>
+              <w:t xml:space="preserve">Vibe coding</w:t>
+            </w:r>
+          </w:p>
+        </w:tc>
+        <w:tc>
+          <w:tcPr>
+            <w:tcW w:type="dxa" w:w="6726"/>
+            <w:shd w:fill="FFFFFF" w:val="clear"/>
+            <w:tcMar>
+              <w:top w:type="dxa" w:w="70"/>
+              <w:left w:type="dxa" w:w="120"/>
+              <w:bottom w:type="dxa" w:w="70"/>
+              <w:right w:type="dxa" w:w="120"/>
+            </w:tcMar>
+          </w:tcPr>
+          <w:p>
+            <w:pPr>
+              <w:spacing w:after="0"/>
+            </w:pPr>
+            <w:r>
+              <w:rPr>
+                <w:sz w:val="21"/>
+                <w:szCs w:val="21"/>
+              </w:rPr>
+              <w:t xml:space="preserve">Building software by describing what you want, instead of writing the code.</w:t>
+            </w:r>
+          </w:p>
+        </w:tc>
+      </w:tr>
+      <w:tr>
+        <w:trPr>
+          <w:cantSplit/>
+        </w:trPr>
+        <w:tc>
+          <w:tcPr>
+            <w:tcW w:type="dxa" w:w="2300"/>
+            <w:shd w:fill="EDF2F7" w:val="clear"/>
+            <w:tcMar>
+              <w:top w:type="dxa" w:w="70"/>
+              <w:left w:type="dxa" w:w="120"/>
+              <w:bottom w:type="dxa" w:w="70"/>
+              <w:right w:type="dxa" w:w="120"/>
+            </w:tcMar>
+          </w:tcPr>
+          <w:p>
+            <w:pPr>
+              <w:spacing w:after="0"/>
+            </w:pPr>
+            <w:r>
+              <w:rPr>
+                <w:sz w:val="21"/>
+                <w:szCs w:val="21"/>
+              </w:rPr>
+              <w:t xml:space="preserve">Claude Design</w:t>
+            </w:r>
+          </w:p>
+        </w:tc>
+        <w:tc>
+          <w:tcPr>
+            <w:tcW w:type="dxa" w:w="6726"/>
+            <w:shd w:fill="EDF2F7" w:val="clear"/>
+            <w:tcMar>
+              <w:top w:type="dxa" w:w="70"/>
+              <w:left w:type="dxa" w:w="120"/>
+              <w:bottom w:type="dxa" w:w="70"/>
+              <w:right w:type="dxa" w:w="120"/>
+            </w:tcMar>
+          </w:tcPr>
+          <w:p>
+            <w:pPr>
+              <w:spacing w:after="0"/>
+            </w:pPr>
+            <w:r>
+              <w:rPr>
+                <w:sz w:val="21"/>
+                <w:szCs w:val="21"/>
+              </w:rPr>
+              <w:t xml:space="preserve">Builds mockups, landing pages and simple websites from a plain description.</w:t>
+            </w:r>
+          </w:p>
+        </w:tc>
+      </w:tr>
+      <w:tr>
+        <w:trPr>
+          <w:cantSplit/>
+        </w:trPr>
+        <w:tc>
+          <w:tcPr>
+            <w:tcW w:type="dxa" w:w="2300"/>
+            <w:shd w:fill="FFFFFF" w:val="clear"/>
+            <w:tcMar>
+              <w:top w:type="dxa" w:w="70"/>
+              <w:left w:type="dxa" w:w="120"/>
+              <w:bottom w:type="dxa" w:w="70"/>
+              <w:right w:type="dxa" w:w="120"/>
+            </w:tcMar>
+          </w:tcPr>
+          <w:p>
+            <w:pPr>
+              <w:spacing w:after="0"/>
+            </w:pPr>
+            <w:r>
+              <w:rPr>
+                <w:sz w:val="21"/>
+                <w:szCs w:val="21"/>
+              </w:rPr>
+              <w:t xml:space="preserve">Agent</w:t>
+            </w:r>
+          </w:p>
+        </w:tc>
+        <w:tc>
+          <w:tcPr>
+            <w:tcW w:type="dxa" w:w="6726"/>
+            <w:shd w:fill="FFFFFF" w:val="clear"/>
+            <w:tcMar>
+              <w:top w:type="dxa" w:w="70"/>
+              <w:left w:type="dxa" w:w="120"/>
+              <w:bottom w:type="dxa" w:w="70"/>
+              <w:right w:type="dxa" w:w="120"/>
+            </w:tcMar>
+          </w:tcPr>
+          <w:p>
+            <w:pPr>
+              <w:spacing w:after="0"/>
+            </w:pPr>
+            <w:r>
+              <w:rPr>
+                <w:sz w:val="21"/>
+                <w:szCs w:val="21"/>
+              </w:rPr>
+              <w:t xml:space="preserve">Claude working toward a goal across several steps, often scheduled, reporting back.</w:t>
+            </w:r>
+          </w:p>
+        </w:tc>
+      </w:tr>
+      <w:tr>
+        <w:trPr>
+          <w:cantSplit/>
+        </w:trPr>
+        <w:tc>
+          <w:tcPr>
+            <w:tcW w:type="dxa" w:w="2300"/>
+            <w:shd w:fill="EDF2F7" w:val="clear"/>
+            <w:tcMar>
+              <w:top w:type="dxa" w:w="70"/>
+              <w:left w:type="dxa" w:w="120"/>
+              <w:bottom w:type="dxa" w:w="70"/>
+              <w:right w:type="dxa" w:w="120"/>
+            </w:tcMar>
+          </w:tcPr>
+          <w:p>
+            <w:pPr>
+              <w:spacing w:after="0"/>
+            </w:pPr>
+            <w:r>
+              <w:rPr>
+                <w:sz w:val="21"/>
+                <w:szCs w:val="21"/>
+              </w:rPr>
+              <w:t xml:space="preserve">Trigger</w:t>
+            </w:r>
+          </w:p>
+        </w:tc>
+        <w:tc>
+          <w:tcPr>
+            <w:tcW w:type="dxa" w:w="6726"/>
+            <w:shd w:fill="EDF2F7" w:val="clear"/>
+            <w:tcMar>
+              <w:top w:type="dxa" w:w="70"/>
+              <w:left w:type="dxa" w:w="120"/>
+              <w:bottom w:type="dxa" w:w="70"/>
+              <w:right w:type="dxa" w:w="120"/>
+            </w:tcMar>
+          </w:tcPr>
+          <w:p>
+            <w:pPr>
+              <w:spacing w:after="0"/>
+            </w:pPr>
+            <w:r>
+              <w:rPr>
+                <w:sz w:val="21"/>
+                <w:szCs w:val="21"/>
+              </w:rPr>
+              <w:t xml:space="preserve">The time or event that starts an agent.</w:t>
+            </w:r>
+          </w:p>
+        </w:tc>
+      </w:tr>
+      <w:tr>
+        <w:trPr>
+          <w:cantSplit/>
+        </w:trPr>
+        <w:tc>
+          <w:tcPr>
+            <w:tcW w:type="dxa" w:w="2300"/>
+            <w:shd w:fill="FFFFFF" w:val="clear"/>
+            <w:tcMar>
+              <w:top w:type="dxa" w:w="70"/>
+              <w:left w:type="dxa" w:w="120"/>
+              <w:bottom w:type="dxa" w:w="70"/>
+              <w:right w:type="dxa" w:w="120"/>
+            </w:tcMar>
+          </w:tcPr>
+          <w:p>
+            <w:pPr>
+              <w:spacing w:after="0"/>
+            </w:pPr>
+            <w:r>
+              <w:rPr>
+                <w:sz w:val="21"/>
+                <w:szCs w:val="21"/>
+              </w:rPr>
+              <w:t xml:space="preserve">API</w:t>
+            </w:r>
+          </w:p>
+        </w:tc>
+        <w:tc>
+          <w:tcPr>
+            <w:tcW w:type="dxa" w:w="6726"/>
+            <w:shd w:fill="FFFFFF" w:val="clear"/>
+            <w:tcMar>
+              <w:top w:type="dxa" w:w="70"/>
+              <w:left w:type="dxa" w:w="120"/>
+              <w:bottom w:type="dxa" w:w="70"/>
+              <w:right w:type="dxa" w:w="120"/>
+            </w:tcMar>
+          </w:tcPr>
+          <w:p>
+            <w:pPr>
+              <w:spacing w:after="0"/>
+            </w:pPr>
+            <w:r>
+              <w:rPr>
+                <w:sz w:val="21"/>
+                <w:szCs w:val="21"/>
+              </w:rPr>
+              <w:t xml:space="preserve">A way for your own program to talk to Claude directly, billed per token.</w:t>
+            </w:r>
+          </w:p>
+        </w:tc>
+      </w:tr>
+    </w:tbl>
+    <w:p>
+      <w:pPr>
+        <w:spacing w:after="80" w:line="120" w:lineRule="exact"/>
+      </w:pPr>
+    </w:p>
+    <w:p>
+      <w:pPr>
         <w:pStyle w:val="Heading1"/>
         <w:keepNext/>
         <w:keepLines/>
@@ -4990,7 +6396,7 @@
         <w:spacing w:after="100" w:line="262"/>
       </w:pPr>
       <w:r>
-        <w:t xml:space="preserve">If you have worked through Level Zero and this Level One book, you can now set Claude up well, produce real deliverables, handle data responsibly, keep your source safe and shared, take a first step into Code and Claude Design, and run a small agent. That is most of what most people ever need.</w:t>
+        <w:t xml:space="preserve">If you have worked through Level Zero and this Level One book, you can now set Claude up well, produce real deliverables, handle data responsibly, keep your source safe and shared, take a first step into Code and Claude Design, and run a small agent. In my experience, that covers most of what people need day to day.</w:t>
       </w:r>
     </w:p>
     <w:p>

</xml_diff>